<commit_message>
Adding publications page and putting research under construction
</commit_message>
<xml_diff>
--- a/files/ATCribb_CV.docx
+++ b/files/ATCribb_CV.docx
@@ -2166,27 +2166,7 @@
                 <w:szCs w:val="23"/>
                 <w:lang w:val="en-GB"/>
               </w:rPr>
-              <w:t>Women in Science and Engineering (</w:t>
-            </w:r>
-            <w:proofErr w:type="spellStart"/>
-            <w:r>
-              <w:rPr>
-                <w:rFonts w:ascii="Source Serif Pro Light" w:hAnsi="Source Serif Pro Light" w:cs="Times New Roman"/>
-                <w:sz w:val="23"/>
-                <w:szCs w:val="23"/>
-                <w:lang w:val="en-GB"/>
-              </w:rPr>
-              <w:t>WiSE</w:t>
-            </w:r>
-            <w:proofErr w:type="spellEnd"/>
-            <w:r>
-              <w:rPr>
-                <w:rFonts w:ascii="Source Serif Pro Light" w:hAnsi="Source Serif Pro Light" w:cs="Times New Roman"/>
-                <w:sz w:val="23"/>
-                <w:szCs w:val="23"/>
-                <w:lang w:val="en-GB"/>
-              </w:rPr>
-              <w:t>) - University of Southern California</w:t>
+              <w:t>Women in Science and Engineering (WiSE) - University of Southern California</w:t>
             </w:r>
           </w:p>
         </w:tc>
@@ -3374,67 +3354,7 @@
                 <w:szCs w:val="23"/>
                 <w:lang w:val="en-GB"/>
               </w:rPr>
-              <w:t xml:space="preserve"> </w:t>
-            </w:r>
-            <w:proofErr w:type="spellStart"/>
-            <w:r>
-              <w:rPr>
-                <w:rFonts w:ascii="Source Serif Pro Light" w:hAnsi="Source Serif Pro Light" w:cs="Times New Roman"/>
-                <w:sz w:val="23"/>
-                <w:szCs w:val="23"/>
-                <w:lang w:val="en-GB"/>
-              </w:rPr>
-              <w:t>Djunistee</w:t>
-            </w:r>
-            <w:proofErr w:type="spellEnd"/>
-            <w:r>
-              <w:rPr>
-                <w:rFonts w:ascii="Source Serif Pro Light" w:hAnsi="Source Serif Pro Light" w:cs="Times New Roman"/>
-                <w:sz w:val="23"/>
-                <w:szCs w:val="23"/>
-                <w:lang w:val="en-GB"/>
-              </w:rPr>
-              <w:t xml:space="preserve">, I.A.P., Gearty, W., Gibson, B.&lt;., Gotelli, N.J., Hayes, R., Hull, P.M., Ibarra, D.E., Lee, J., </w:t>
-            </w:r>
-            <w:proofErr w:type="spellStart"/>
-            <w:r>
-              <w:rPr>
-                <w:rFonts w:ascii="Source Serif Pro Light" w:hAnsi="Source Serif Pro Light" w:cs="Times New Roman"/>
-                <w:sz w:val="23"/>
-                <w:szCs w:val="23"/>
-                <w:lang w:val="en-GB"/>
-              </w:rPr>
-              <w:t>Looy</w:t>
-            </w:r>
-            <w:proofErr w:type="spellEnd"/>
-            <w:r>
-              <w:rPr>
-                <w:rFonts w:ascii="Source Serif Pro Light" w:hAnsi="Source Serif Pro Light" w:cs="Times New Roman"/>
-                <w:sz w:val="23"/>
-                <w:szCs w:val="23"/>
-                <w:lang w:val="en-GB"/>
-              </w:rPr>
-              <w:t xml:space="preserve">, C.V., Muddiman, B., Shupinski, A.B., </w:t>
-            </w:r>
-            <w:proofErr w:type="spellStart"/>
-            <w:r>
-              <w:rPr>
-                <w:rFonts w:ascii="Source Serif Pro Light" w:hAnsi="Source Serif Pro Light" w:cs="Times New Roman"/>
-                <w:sz w:val="23"/>
-                <w:szCs w:val="23"/>
-                <w:lang w:val="en-GB"/>
-              </w:rPr>
-              <w:t>Sjosten</w:t>
-            </w:r>
-            <w:proofErr w:type="spellEnd"/>
-            <w:r>
-              <w:rPr>
-                <w:rFonts w:ascii="Source Serif Pro Light" w:hAnsi="Source Serif Pro Light" w:cs="Times New Roman"/>
-                <w:sz w:val="23"/>
-                <w:szCs w:val="23"/>
-                <w:lang w:val="en-GB"/>
-              </w:rPr>
-              <w:t>, S., Smith, F.A., Stigall, A.L., Tome, C.P., Tingle, K., Turk, K.A., Villaseñor, A., Wagner, P.J., Wagner, J.D., Wang, S.C., Lyons, S.K.</w:t>
+              <w:t xml:space="preserve"> Djunistee, I.A.P., Gearty, W., Gibson, B.&lt;., Gotelli, N.J., Hayes, R., Hull, P.M., Ibarra, D.E., Lee, J., Looy, C.V., Muddiman, B., Shupinski, A.B., Sjosten, S., Smith, F.A., Stigall, A.L., Tome, C.P., Tingle, K., Turk, K.A., Villaseñor, A., Wagner, P.J., Wagner, J.D., Wang, S.C., Lyons, S.K.</w:t>
             </w:r>
             <w:r>
               <w:rPr>
@@ -3665,25 +3585,14 @@
               </w:rPr>
               <w:t>(</w:t>
             </w:r>
-            <w:proofErr w:type="spellStart"/>
-            <w:r>
-              <w:rPr>
-                <w:rFonts w:ascii="Source Serif Pro Light" w:hAnsi="Source Serif Pro Light" w:cs="Times New Roman"/>
-                <w:sz w:val="23"/>
-                <w:szCs w:val="23"/>
-                <w:lang w:val="en-GB"/>
-              </w:rPr>
-              <w:t>doi</w:t>
-            </w:r>
-            <w:proofErr w:type="spellEnd"/>
-            <w:r>
-              <w:rPr>
-                <w:rFonts w:ascii="Source Serif Pro Light" w:hAnsi="Source Serif Pro Light" w:cs="Times New Roman"/>
-                <w:sz w:val="23"/>
-                <w:szCs w:val="23"/>
-                <w:lang w:val="en-GB"/>
-              </w:rPr>
-              <w:t>:</w:t>
+            <w:r>
+              <w:rPr>
+                <w:rFonts w:ascii="Source Serif Pro Light" w:hAnsi="Source Serif Pro Light" w:cs="Times New Roman"/>
+                <w:sz w:val="23"/>
+                <w:szCs w:val="23"/>
+                <w:lang w:val="en-GB"/>
+              </w:rPr>
+              <w:t>doi:</w:t>
             </w:r>
             <w:r>
               <w:rPr>
@@ -3798,7 +3707,7 @@
                 <w:szCs w:val="23"/>
                 <w:lang w:val="en-GB"/>
               </w:rPr>
-              <w:t xml:space="preserve"> Zhao, L., Jiang, Y., Zhao, H., Yan, P., Huang, Y. Predatory-prey interactions in the Early Triassic ocean. </w:t>
+              <w:t xml:space="preserve"> Zhao, L., Jiang, Y., Zhao, H., Yan, P., Huang, Y. Predator-prey interactions in the Early Triassic ocean. </w:t>
             </w:r>
             <w:r>
               <w:rPr>
@@ -3829,7 +3738,25 @@
                 <w:szCs w:val="23"/>
                 <w:lang w:val="en-GB"/>
               </w:rPr>
-              <w:t>138, 3807-1818</w:t>
+              <w:t>138, 3807-</w:t>
+            </w:r>
+            <w:r>
+              <w:rPr>
+                <w:rFonts w:ascii="Source Serif Pro Light" w:hAnsi="Source Serif Pro Light" w:cs="Times New Roman"/>
+                <w:sz w:val="23"/>
+                <w:szCs w:val="23"/>
+                <w:lang w:val="en-GB"/>
+              </w:rPr>
+              <w:t>3</w:t>
+            </w:r>
+            <w:r>
+              <w:rPr>
+                <w:rFonts w:ascii="Source Serif Pro Light" w:hAnsi="Source Serif Pro Light" w:cs="Times New Roman"/>
+                <w:sz w:val="23"/>
+                <w:szCs w:val="23"/>
+                <w:lang w:val="en-GB"/>
+              </w:rPr>
+              <w:t>818</w:t>
             </w:r>
             <w:r>
               <w:rPr>
@@ -3860,27 +3787,7 @@
                 <w:szCs w:val="23"/>
                 <w:lang w:val="en-GB"/>
               </w:rPr>
-              <w:t>(</w:t>
-            </w:r>
-            <w:proofErr w:type="spellStart"/>
-            <w:r>
-              <w:rPr>
-                <w:rFonts w:ascii="Source Serif Pro Light" w:hAnsi="Source Serif Pro Light" w:cs="Times New Roman"/>
-                <w:sz w:val="23"/>
-                <w:szCs w:val="23"/>
-                <w:lang w:val="en-GB"/>
-              </w:rPr>
-              <w:t>doi</w:t>
-            </w:r>
-            <w:proofErr w:type="spellEnd"/>
-            <w:r>
-              <w:rPr>
-                <w:rFonts w:ascii="Source Serif Pro Light" w:hAnsi="Source Serif Pro Light" w:cs="Times New Roman"/>
-                <w:sz w:val="23"/>
-                <w:szCs w:val="23"/>
-                <w:lang w:val="en-GB"/>
-              </w:rPr>
-              <w:t>: 10.1130/B38</w:t>
+              <w:t>(doi: 10.1130/B38</w:t>
             </w:r>
             <w:r>
               <w:rPr>
@@ -3990,67 +3897,7 @@
                 <w:szCs w:val="23"/>
                 <w:lang w:val="en-GB"/>
               </w:rPr>
-              <w:t xml:space="preserve">Bates, A.E., Clapham, M.E., Contreras, D.L., Craffey, M., </w:t>
-            </w:r>
-            <w:proofErr w:type="spellStart"/>
-            <w:r>
-              <w:rPr>
-                <w:rFonts w:ascii="Source Serif Pro Light" w:hAnsi="Source Serif Pro Light" w:cs="Times New Roman"/>
-                <w:sz w:val="23"/>
-                <w:szCs w:val="23"/>
-                <w:lang w:val="en-GB"/>
-              </w:rPr>
-              <w:t>Duijnstee</w:t>
-            </w:r>
-            <w:proofErr w:type="spellEnd"/>
-            <w:r>
-              <w:rPr>
-                <w:rFonts w:ascii="Source Serif Pro Light" w:hAnsi="Source Serif Pro Light" w:cs="Times New Roman"/>
-                <w:sz w:val="23"/>
-                <w:szCs w:val="23"/>
-                <w:lang w:val="en-GB"/>
-              </w:rPr>
-              <w:t xml:space="preserve">, I.A.P., Gearty, W., Gotelli, N.J., Hamilton, M.J., Hayes, R.F., Hull, P.M., Ibarra, D.E., Lee, J., </w:t>
-            </w:r>
-            <w:proofErr w:type="spellStart"/>
-            <w:r>
-              <w:rPr>
-                <w:rFonts w:ascii="Source Serif Pro Light" w:hAnsi="Source Serif Pro Light" w:cs="Times New Roman"/>
-                <w:sz w:val="23"/>
-                <w:szCs w:val="23"/>
-                <w:lang w:val="en-GB"/>
-              </w:rPr>
-              <w:t>Looy</w:t>
-            </w:r>
-            <w:proofErr w:type="spellEnd"/>
-            <w:r>
-              <w:rPr>
-                <w:rFonts w:ascii="Source Serif Pro Light" w:hAnsi="Source Serif Pro Light" w:cs="Times New Roman"/>
-                <w:sz w:val="23"/>
-                <w:szCs w:val="23"/>
-                <w:lang w:val="en-GB"/>
-              </w:rPr>
-              <w:t xml:space="preserve">, C.V., Lyson, T.R., Muddiman, B., Roopnarine, P.D., Shupinski, A.B., Smith, F.A., Stigall, A.L., Tome, C.P., Turk, K.A., </w:t>
-            </w:r>
-            <w:proofErr w:type="spellStart"/>
-            <w:r>
-              <w:rPr>
-                <w:rFonts w:ascii="Source Serif Pro Light" w:hAnsi="Source Serif Pro Light" w:cs="Times New Roman"/>
-                <w:sz w:val="23"/>
-                <w:szCs w:val="23"/>
-                <w:lang w:val="en-GB"/>
-              </w:rPr>
-              <w:t>Viallaseñor</w:t>
-            </w:r>
-            <w:proofErr w:type="spellEnd"/>
-            <w:r>
-              <w:rPr>
-                <w:rFonts w:ascii="Source Serif Pro Light" w:hAnsi="Source Serif Pro Light" w:cs="Times New Roman"/>
-                <w:sz w:val="23"/>
-                <w:szCs w:val="23"/>
-                <w:lang w:val="en-GB"/>
-              </w:rPr>
-              <w:t>, A., Wagner, P.J., Wang, S., Lyons, S.K.</w:t>
+              <w:t>Bates, A.E., Clapham, M.E., Contreras, D.L., Craffey, M., Duijnstee, I.A.P., Gearty, W., Gotelli, N.J., Hamilton, M.J., Hayes, R.F., Hull, P.M., Ibarra, D.E., Lee, J., Looy, C.V., Lyson, T.R., Muddiman, B., Roopnarine, P.D., Shupinski, A.B., Smith, F.A., Stigall, A.L., Tome, C.P., Turk, K.A., Viallaseñor, A., Wagner, P.J., Wang, S., Lyons, S.K.</w:t>
             </w:r>
             <w:r>
               <w:rPr>
@@ -4139,25 +3986,14 @@
               </w:rPr>
               <w:t>(</w:t>
             </w:r>
-            <w:proofErr w:type="spellStart"/>
-            <w:r>
-              <w:rPr>
-                <w:rFonts w:ascii="Source Serif Pro Light" w:hAnsi="Source Serif Pro Light" w:cs="Times New Roman"/>
-                <w:sz w:val="23"/>
-                <w:szCs w:val="23"/>
-                <w:lang w:val="en-GB"/>
-              </w:rPr>
-              <w:t>doi</w:t>
-            </w:r>
-            <w:proofErr w:type="spellEnd"/>
-            <w:r>
-              <w:rPr>
-                <w:rFonts w:ascii="Source Serif Pro Light" w:hAnsi="Source Serif Pro Light" w:cs="Times New Roman"/>
-                <w:sz w:val="23"/>
-                <w:szCs w:val="23"/>
-                <w:lang w:val="en-GB"/>
-              </w:rPr>
-              <w:t xml:space="preserve">: </w:t>
+            <w:r>
+              <w:rPr>
+                <w:rFonts w:ascii="Source Serif Pro Light" w:hAnsi="Source Serif Pro Light" w:cs="Times New Roman"/>
+                <w:sz w:val="23"/>
+                <w:szCs w:val="23"/>
+                <w:lang w:val="en-GB"/>
+              </w:rPr>
+              <w:t xml:space="preserve">doi: </w:t>
             </w:r>
             <w:bookmarkStart w:id="0" w:name="OLE_LINK1"/>
             <w:r>
@@ -4253,27 +4089,7 @@
                 <w:szCs w:val="23"/>
                 <w:lang w:val="en-GB"/>
               </w:rPr>
-              <w:t xml:space="preserve">, Zill, M., Phelps, W., </w:t>
-            </w:r>
-            <w:proofErr w:type="spellStart"/>
-            <w:r>
-              <w:rPr>
-                <w:rFonts w:ascii="Source Serif Pro Light" w:hAnsi="Source Serif Pro Light" w:cs="Times New Roman"/>
-                <w:sz w:val="23"/>
-                <w:szCs w:val="23"/>
-                <w:lang w:val="en-GB"/>
-              </w:rPr>
-              <w:t>Savrda</w:t>
-            </w:r>
-            <w:proofErr w:type="spellEnd"/>
-            <w:r>
-              <w:rPr>
-                <w:rFonts w:ascii="Source Serif Pro Light" w:hAnsi="Source Serif Pro Light" w:cs="Times New Roman"/>
-                <w:sz w:val="23"/>
-                <w:szCs w:val="23"/>
-                <w:lang w:val="en-GB"/>
-              </w:rPr>
-              <w:t xml:space="preserve">, C.E., Droser, M.L., Bottjer, D.J., Clapham, M.E. </w:t>
+              <w:t xml:space="preserve">, Zill, M., Phelps, W., Savrda, C.E., Droser, M.L., Bottjer, D.J., Clapham, M.E. </w:t>
             </w:r>
             <w:r>
               <w:rPr>
@@ -4340,47 +4156,7 @@
                 <w:szCs w:val="23"/>
                 <w:lang w:val="en-GB"/>
               </w:rPr>
-              <w:t xml:space="preserve"> (</w:t>
-            </w:r>
-            <w:proofErr w:type="spellStart"/>
-            <w:r>
-              <w:rPr>
-                <w:rFonts w:ascii="Source Serif Pro Light" w:hAnsi="Source Serif Pro Light" w:cs="Times New Roman"/>
-                <w:sz w:val="23"/>
-                <w:szCs w:val="23"/>
-                <w:lang w:val="en-GB"/>
-              </w:rPr>
-              <w:t>doi</w:t>
-            </w:r>
-            <w:proofErr w:type="spellEnd"/>
-            <w:r>
-              <w:rPr>
-                <w:rFonts w:ascii="Source Serif Pro Light" w:hAnsi="Source Serif Pro Light" w:cs="Times New Roman"/>
-                <w:sz w:val="23"/>
-                <w:szCs w:val="23"/>
-                <w:lang w:val="en-GB"/>
-              </w:rPr>
-              <w:t>: 10.1126/</w:t>
-            </w:r>
-            <w:proofErr w:type="gramStart"/>
-            <w:r>
-              <w:rPr>
-                <w:rFonts w:ascii="Source Serif Pro Light" w:hAnsi="Source Serif Pro Light" w:cs="Times New Roman"/>
-                <w:sz w:val="23"/>
-                <w:szCs w:val="23"/>
-                <w:lang w:val="en-GB"/>
-              </w:rPr>
-              <w:t>sciadv.adu</w:t>
-            </w:r>
-            <w:proofErr w:type="gramEnd"/>
-            <w:r>
-              <w:rPr>
-                <w:rFonts w:ascii="Source Serif Pro Light" w:hAnsi="Source Serif Pro Light" w:cs="Times New Roman"/>
-                <w:sz w:val="23"/>
-                <w:szCs w:val="23"/>
-                <w:lang w:val="en-GB"/>
-              </w:rPr>
-              <w:t>7719)</w:t>
+              <w:t xml:space="preserve"> (doi: 10.1126/sciadv.adu7719)</w:t>
             </w:r>
           </w:p>
         </w:tc>
@@ -4485,27 +4261,7 @@
                 <w:szCs w:val="23"/>
                 <w:lang w:val="en-GB"/>
               </w:rPr>
-              <w:t>, 67, e12726. (</w:t>
-            </w:r>
-            <w:proofErr w:type="spellStart"/>
-            <w:r>
-              <w:rPr>
-                <w:rFonts w:ascii="Source Serif Pro Light" w:hAnsi="Source Serif Pro Light" w:cs="Times New Roman"/>
-                <w:sz w:val="23"/>
-                <w:szCs w:val="23"/>
-                <w:lang w:val="en-GB"/>
-              </w:rPr>
-              <w:t>doi</w:t>
-            </w:r>
-            <w:proofErr w:type="spellEnd"/>
-            <w:r>
-              <w:rPr>
-                <w:rFonts w:ascii="Source Serif Pro Light" w:hAnsi="Source Serif Pro Light" w:cs="Times New Roman"/>
-                <w:sz w:val="23"/>
-                <w:szCs w:val="23"/>
-                <w:lang w:val="en-GB"/>
-              </w:rPr>
-              <w:t>: 10.1111/pala.12726)</w:t>
+              <w:t>, 67, e12726. (doi: 10.1111/pala.12726)</w:t>
             </w:r>
             <w:r>
               <w:rPr>
@@ -4627,27 +4383,7 @@
                 <w:szCs w:val="23"/>
                 <w:lang w:val="en-GB"/>
               </w:rPr>
-              <w:t>, 290, 20232232. (</w:t>
-            </w:r>
-            <w:proofErr w:type="spellStart"/>
-            <w:r>
-              <w:rPr>
-                <w:rFonts w:ascii="Source Serif Pro Light" w:hAnsi="Source Serif Pro Light" w:cs="Times New Roman"/>
-                <w:sz w:val="23"/>
-                <w:szCs w:val="23"/>
-                <w:lang w:val="en-GB"/>
-              </w:rPr>
-              <w:t>doi</w:t>
-            </w:r>
-            <w:proofErr w:type="spellEnd"/>
-            <w:r>
-              <w:rPr>
-                <w:rFonts w:ascii="Source Serif Pro Light" w:hAnsi="Source Serif Pro Light" w:cs="Times New Roman"/>
-                <w:sz w:val="23"/>
-                <w:szCs w:val="23"/>
-                <w:lang w:val="en-GB"/>
-              </w:rPr>
-              <w:t xml:space="preserve">: 10.1098/rspb.2023.2232) </w:t>
+              <w:t xml:space="preserve">, 290, 20232232. (doi: 10.1098/rspb.2023.2232) </w:t>
             </w:r>
           </w:p>
         </w:tc>
@@ -4721,27 +4457,7 @@
                 <w:szCs w:val="23"/>
                 <w:lang w:val="en-GB"/>
               </w:rPr>
-              <w:t>, van de Velde, S. J., Berelson, W. M., Bottjer. D. J., and Corsetti, F. A. 2023. Ediacaran-Cambrian bioturbation did not extensively oxygenate sediments in shallow marine ecosystems. Geobiology, 24, 435-453. (</w:t>
-            </w:r>
-            <w:proofErr w:type="spellStart"/>
-            <w:r>
-              <w:rPr>
-                <w:rFonts w:ascii="Source Serif Pro Light" w:hAnsi="Source Serif Pro Light" w:cs="Times New Roman"/>
-                <w:sz w:val="23"/>
-                <w:szCs w:val="23"/>
-                <w:lang w:val="en-GB"/>
-              </w:rPr>
-              <w:t>doi</w:t>
-            </w:r>
-            <w:proofErr w:type="spellEnd"/>
-            <w:r>
-              <w:rPr>
-                <w:rFonts w:ascii="Source Serif Pro Light" w:hAnsi="Source Serif Pro Light" w:cs="Times New Roman"/>
-                <w:sz w:val="23"/>
-                <w:szCs w:val="23"/>
-                <w:lang w:val="en-GB"/>
-              </w:rPr>
-              <w:t xml:space="preserve">: 10.1111/gbi.12550) </w:t>
+              <w:t xml:space="preserve">, van de Velde, S. J., Berelson, W. M., Bottjer. D. J., and Corsetti, F. A. 2023. Ediacaran-Cambrian bioturbation did not extensively oxygenate sediments in shallow marine ecosystems. Geobiology, 24, 435-453. (doi: 10.1111/gbi.12550) </w:t>
             </w:r>
           </w:p>
         </w:tc>
@@ -4844,47 +4560,7 @@
                 <w:szCs w:val="23"/>
                 <w:lang w:val="en-GB"/>
               </w:rPr>
-              <w:t>, 8, eabo0596 (</w:t>
-            </w:r>
-            <w:proofErr w:type="spellStart"/>
-            <w:r>
-              <w:rPr>
-                <w:rFonts w:ascii="Source Serif Pro Light" w:hAnsi="Source Serif Pro Light" w:cs="Times New Roman"/>
-                <w:sz w:val="23"/>
-                <w:szCs w:val="23"/>
-                <w:lang w:val="en-GB"/>
-              </w:rPr>
-              <w:t>doi</w:t>
-            </w:r>
-            <w:proofErr w:type="spellEnd"/>
-            <w:r>
-              <w:rPr>
-                <w:rFonts w:ascii="Source Serif Pro Light" w:hAnsi="Source Serif Pro Light" w:cs="Times New Roman"/>
-                <w:sz w:val="23"/>
-                <w:szCs w:val="23"/>
-                <w:lang w:val="en-GB"/>
-              </w:rPr>
-              <w:t>: 10.1126/</w:t>
-            </w:r>
-            <w:proofErr w:type="gramStart"/>
-            <w:r>
-              <w:rPr>
-                <w:rFonts w:ascii="Source Serif Pro Light" w:hAnsi="Source Serif Pro Light" w:cs="Times New Roman"/>
-                <w:sz w:val="23"/>
-                <w:szCs w:val="23"/>
-                <w:lang w:val="en-GB"/>
-              </w:rPr>
-              <w:t>sciadv.abo</w:t>
-            </w:r>
-            <w:proofErr w:type="gramEnd"/>
-            <w:r>
-              <w:rPr>
-                <w:rFonts w:ascii="Source Serif Pro Light" w:hAnsi="Source Serif Pro Light" w:cs="Times New Roman"/>
-                <w:sz w:val="23"/>
-                <w:szCs w:val="23"/>
-                <w:lang w:val="en-GB"/>
-              </w:rPr>
-              <w:t>0597).</w:t>
+              <w:t>, 8, eabo0596 (doi: 10.1126/sciadv.abo0597).</w:t>
             </w:r>
           </w:p>
         </w:tc>
@@ -4987,27 +4663,7 @@
                 <w:szCs w:val="23"/>
                 <w:lang w:val="en-GB"/>
               </w:rPr>
-              <w:t>, 103435. (</w:t>
-            </w:r>
-            <w:proofErr w:type="spellStart"/>
-            <w:r>
-              <w:rPr>
-                <w:rFonts w:ascii="Source Serif Pro Light" w:hAnsi="Source Serif Pro Light" w:cs="Times New Roman"/>
-                <w:sz w:val="23"/>
-                <w:szCs w:val="23"/>
-                <w:lang w:val="en-GB"/>
-              </w:rPr>
-              <w:t>doi</w:t>
-            </w:r>
-            <w:proofErr w:type="spellEnd"/>
-            <w:r>
-              <w:rPr>
-                <w:rFonts w:ascii="Source Serif Pro Light" w:hAnsi="Source Serif Pro Light" w:cs="Times New Roman"/>
-                <w:sz w:val="23"/>
-                <w:szCs w:val="23"/>
-                <w:lang w:val="en-GB"/>
-              </w:rPr>
-              <w:t>:</w:t>
+              <w:t>, 103435. (doi:</w:t>
             </w:r>
             <w:r>
               <w:rPr>
@@ -5147,31 +4803,7 @@
                 <w:shd w:val="clear" w:color="auto" w:fill="FFFFFF"/>
                 <w:lang w:val="en-GB"/>
               </w:rPr>
-              <w:t>, 556, 109884. (</w:t>
-            </w:r>
-            <w:proofErr w:type="gramStart"/>
-            <w:r>
-              <w:rPr>
-                <w:rFonts w:ascii="Source Serif Pro Light" w:eastAsia="Times New Roman" w:hAnsi="Source Serif Pro Light" w:cs="Calibri"/>
-                <w:color w:val="000000"/>
-                <w:sz w:val="23"/>
-                <w:szCs w:val="23"/>
-                <w:shd w:val="clear" w:color="auto" w:fill="FFFFFF"/>
-                <w:lang w:val="en-GB"/>
-              </w:rPr>
-              <w:t>doi:10.1016/j.palaeo</w:t>
-            </w:r>
-            <w:proofErr w:type="gramEnd"/>
-            <w:r>
-              <w:rPr>
-                <w:rFonts w:ascii="Source Serif Pro Light" w:eastAsia="Times New Roman" w:hAnsi="Source Serif Pro Light" w:cs="Calibri"/>
-                <w:color w:val="000000"/>
-                <w:sz w:val="23"/>
-                <w:szCs w:val="23"/>
-                <w:shd w:val="clear" w:color="auto" w:fill="FFFFFF"/>
-                <w:lang w:val="en-GB"/>
-              </w:rPr>
-              <w:t>.2020.109884)</w:t>
+              <w:t>, 556, 109884. (doi:10.1016/j.palaeo.2020.109884)</w:t>
             </w:r>
           </w:p>
         </w:tc>
@@ -5245,27 +4877,7 @@
                 <w:szCs w:val="23"/>
                 <w:lang w:val="en-GB"/>
               </w:rPr>
-              <w:t xml:space="preserve">, Bottjer, D. J. 2020. Complex marine bioturbation ecosystem engineering </w:t>
-            </w:r>
-            <w:proofErr w:type="spellStart"/>
-            <w:r>
-              <w:rPr>
-                <w:rFonts w:ascii="Source Serif Pro Light" w:hAnsi="Source Serif Pro Light" w:cs="Times New Roman"/>
-                <w:sz w:val="23"/>
-                <w:szCs w:val="23"/>
-                <w:lang w:val="en-GB"/>
-              </w:rPr>
-              <w:t>behaviors</w:t>
-            </w:r>
-            <w:proofErr w:type="spellEnd"/>
-            <w:r>
-              <w:rPr>
-                <w:rFonts w:ascii="Source Serif Pro Light" w:hAnsi="Source Serif Pro Light" w:cs="Times New Roman"/>
-                <w:sz w:val="23"/>
-                <w:szCs w:val="23"/>
-                <w:lang w:val="en-GB"/>
-              </w:rPr>
-              <w:t xml:space="preserve"> persisted in the wake of the end-Permian mass extinction. </w:t>
+              <w:t xml:space="preserve">, Bottjer, D. J. 2020. Complex marine bioturbation ecosystem engineering behaviors persisted in the wake of the end-Permian mass extinction. </w:t>
             </w:r>
             <w:r>
               <w:rPr>
@@ -5625,27 +5237,7 @@
                 <w:szCs w:val="23"/>
                 <w:lang w:val="en-GB"/>
               </w:rPr>
-              <w:t>(</w:t>
-            </w:r>
-            <w:proofErr w:type="spellStart"/>
-            <w:r>
-              <w:rPr>
-                <w:rFonts w:ascii="Source Serif Pro Light" w:hAnsi="Source Serif Pro Light" w:cs="Times New Roman"/>
-                <w:sz w:val="23"/>
-                <w:szCs w:val="23"/>
-                <w:lang w:val="en-GB"/>
-              </w:rPr>
-              <w:t>doi</w:t>
-            </w:r>
-            <w:proofErr w:type="spellEnd"/>
-            <w:r>
-              <w:rPr>
-                <w:rFonts w:ascii="Source Serif Pro Light" w:hAnsi="Source Serif Pro Light" w:cs="Times New Roman"/>
-                <w:sz w:val="23"/>
-                <w:szCs w:val="23"/>
-                <w:lang w:val="en-GB"/>
-              </w:rPr>
-              <w:t>: 10.1016/j.cub.2024.05.038)</w:t>
+              <w:t>(doi: 10.1016/j.cub.2024.05.038)</w:t>
             </w:r>
             <w:r>
               <w:rPr>
@@ -5983,25 +5575,14 @@
                 <w:lang w:val="en-GB"/>
               </w:rPr>
             </w:pPr>
-            <w:proofErr w:type="spellStart"/>
-            <w:r>
-              <w:rPr>
-                <w:rFonts w:ascii="Source Serif Pro Light" w:hAnsi="Source Serif Pro Light" w:cs="Times New Roman"/>
-                <w:sz w:val="23"/>
-                <w:szCs w:val="23"/>
-                <w:lang w:val="en-GB"/>
-              </w:rPr>
-              <w:t>Djunistee</w:t>
-            </w:r>
-            <w:proofErr w:type="spellEnd"/>
-            <w:r>
-              <w:rPr>
-                <w:rFonts w:ascii="Source Serif Pro Light" w:hAnsi="Source Serif Pro Light" w:cs="Times New Roman"/>
-                <w:sz w:val="23"/>
-                <w:szCs w:val="23"/>
-                <w:lang w:val="en-GB"/>
-              </w:rPr>
-              <w:t>, I.</w:t>
+            <w:r>
+              <w:rPr>
+                <w:rFonts w:ascii="Source Serif Pro Light" w:hAnsi="Source Serif Pro Light" w:cs="Times New Roman"/>
+                <w:sz w:val="23"/>
+                <w:szCs w:val="23"/>
+                <w:lang w:val="en-GB"/>
+              </w:rPr>
+              <w:t>Djunistee, I.</w:t>
             </w:r>
             <w:r>
               <w:rPr>
@@ -6075,47 +5656,7 @@
                 <w:szCs w:val="23"/>
                 <w:lang w:val="en-GB"/>
               </w:rPr>
-              <w:t xml:space="preserve"> Contreras, D.L., Craffey, M., Gearty, W., Gotelli, N.J., Hayes, R.F., Hull, P.M., Ibarra, D.E., Lee, J., </w:t>
-            </w:r>
-            <w:proofErr w:type="spellStart"/>
-            <w:r>
-              <w:rPr>
-                <w:rFonts w:ascii="Source Serif Pro Light" w:hAnsi="Source Serif Pro Light" w:cs="Times New Roman"/>
-                <w:sz w:val="23"/>
-                <w:szCs w:val="23"/>
-                <w:lang w:val="en-GB"/>
-              </w:rPr>
-              <w:t>Looy</w:t>
-            </w:r>
-            <w:proofErr w:type="spellEnd"/>
-            <w:r>
-              <w:rPr>
-                <w:rFonts w:ascii="Source Serif Pro Light" w:hAnsi="Source Serif Pro Light" w:cs="Times New Roman"/>
-                <w:sz w:val="23"/>
-                <w:szCs w:val="23"/>
-                <w:lang w:val="en-GB"/>
-              </w:rPr>
-              <w:t xml:space="preserve">, C.V., Lyson, T.R., Muddiman, B., Roopnarine, P.D., Shupinski, A.B., Smith, F.A., Stigall, A.L., Tome, C.P., Turk, K.A., </w:t>
-            </w:r>
-            <w:proofErr w:type="spellStart"/>
-            <w:r>
-              <w:rPr>
-                <w:rFonts w:ascii="Source Serif Pro Light" w:hAnsi="Source Serif Pro Light" w:cs="Times New Roman"/>
-                <w:sz w:val="23"/>
-                <w:szCs w:val="23"/>
-                <w:lang w:val="en-GB"/>
-              </w:rPr>
-              <w:t>Viallaseñor</w:t>
-            </w:r>
-            <w:proofErr w:type="spellEnd"/>
-            <w:r>
-              <w:rPr>
-                <w:rFonts w:ascii="Source Serif Pro Light" w:hAnsi="Source Serif Pro Light" w:cs="Times New Roman"/>
-                <w:sz w:val="23"/>
-                <w:szCs w:val="23"/>
-                <w:lang w:val="en-GB"/>
-              </w:rPr>
-              <w:t>, A., Wagner, P.J., Wang, S., Lyons, S.K.</w:t>
+              <w:t xml:space="preserve"> Contreras, D.L., Craffey, M., Gearty, W., Gotelli, N.J., Hayes, R.F., Hull, P.M., Ibarra, D.E., Lee, J., Looy, C.V., Lyson, T.R., Muddiman, B., Roopnarine, P.D., Shupinski, A.B., Smith, F.A., Stigall, A.L., Tome, C.P., Turk, K.A., Viallaseñor, A., Wagner, P.J., Wang, S., Lyons, S.K.</w:t>
             </w:r>
             <w:r>
               <w:rPr>
@@ -6347,17 +5888,7 @@
                 <w:szCs w:val="23"/>
                 <w:lang w:val="en-GB"/>
               </w:rPr>
-              <w:t xml:space="preserve">Stockey, R.G., Li, N, </w:t>
-            </w:r>
-            <w:proofErr w:type="spellStart"/>
-            <w:r>
-              <w:rPr>
-                <w:rFonts w:ascii="Source Serif Pro Light" w:hAnsi="Source Serif Pro Light" w:cs="Times New Roman"/>
-                <w:sz w:val="23"/>
-                <w:szCs w:val="23"/>
-                <w:lang w:val="en-GB"/>
-              </w:rPr>
-              <w:t>Plana</w:t>
+              <w:t>Stockey, R.G., Li, N, Plana</w:t>
             </w:r>
             <w:r>
               <w:rPr>
@@ -6375,17 +5906,7 @@
                 <w:szCs w:val="23"/>
                 <w:lang w:val="en-GB"/>
               </w:rPr>
-              <w:t>sky</w:t>
-            </w:r>
-            <w:proofErr w:type="spellEnd"/>
-            <w:r>
-              <w:rPr>
-                <w:rFonts w:ascii="Source Serif Pro Light" w:hAnsi="Source Serif Pro Light" w:cs="Times New Roman"/>
-                <w:sz w:val="23"/>
-                <w:szCs w:val="23"/>
-                <w:lang w:val="en-GB"/>
-              </w:rPr>
-              <w:t xml:space="preserve">, N.J., Pohl, A., Finnegan, S., Sperling, E.A., </w:t>
+              <w:t xml:space="preserve">sky, N.J., Pohl, A., Finnegan, S., Sperling, E.A., </w:t>
             </w:r>
             <w:r>
               <w:rPr>
@@ -6560,67 +6081,7 @@
                 <w:szCs w:val="23"/>
                 <w:lang w:val="en-GB"/>
               </w:rPr>
-              <w:t xml:space="preserve">, Gruszka, P., Sartin, A., Monarrez, P. </w:t>
-            </w:r>
-            <w:proofErr w:type="spellStart"/>
-            <w:r>
-              <w:rPr>
-                <w:rFonts w:ascii="Source Serif Pro Light" w:hAnsi="Source Serif Pro Light" w:cs="Times New Roman"/>
-                <w:sz w:val="23"/>
-                <w:szCs w:val="23"/>
-                <w:lang w:val="en-GB"/>
-              </w:rPr>
-              <w:t>PaleoClimR</w:t>
-            </w:r>
-            <w:proofErr w:type="spellEnd"/>
-            <w:r>
-              <w:rPr>
-                <w:rFonts w:ascii="Source Serif Pro Light" w:hAnsi="Source Serif Pro Light" w:cs="Times New Roman"/>
-                <w:sz w:val="23"/>
-                <w:szCs w:val="23"/>
-                <w:lang w:val="en-GB"/>
-              </w:rPr>
-              <w:t>. R package. (in development: github.com/</w:t>
-            </w:r>
-            <w:proofErr w:type="spellStart"/>
-            <w:r>
-              <w:rPr>
-                <w:rFonts w:ascii="Source Serif Pro Light" w:hAnsi="Source Serif Pro Light" w:cs="Times New Roman"/>
-                <w:sz w:val="23"/>
-                <w:szCs w:val="23"/>
-                <w:lang w:val="en-GB"/>
-              </w:rPr>
-              <w:t>richardstockey</w:t>
-            </w:r>
-            <w:proofErr w:type="spellEnd"/>
-            <w:r>
-              <w:rPr>
-                <w:rFonts w:ascii="Source Serif Pro Light" w:hAnsi="Source Serif Pro Light" w:cs="Times New Roman"/>
-                <w:sz w:val="23"/>
-                <w:szCs w:val="23"/>
-                <w:lang w:val="en-GB"/>
-              </w:rPr>
-              <w:t>/</w:t>
-            </w:r>
-            <w:proofErr w:type="spellStart"/>
-            <w:r>
-              <w:rPr>
-                <w:rFonts w:ascii="Source Serif Pro Light" w:hAnsi="Source Serif Pro Light" w:cs="Times New Roman"/>
-                <w:sz w:val="23"/>
-                <w:szCs w:val="23"/>
-                <w:lang w:val="en-GB"/>
-              </w:rPr>
-              <w:t>PaleoClimR</w:t>
-            </w:r>
-            <w:proofErr w:type="spellEnd"/>
-            <w:r>
-              <w:rPr>
-                <w:rFonts w:ascii="Source Serif Pro Light" w:hAnsi="Source Serif Pro Light" w:cs="Times New Roman"/>
-                <w:sz w:val="23"/>
-                <w:szCs w:val="23"/>
-                <w:lang w:val="en-GB"/>
-              </w:rPr>
-              <w:t xml:space="preserve">) </w:t>
+              <w:t xml:space="preserve">, Gruszka, P., Sartin, A., Monarrez, P. PaleoClimR. R package. (in development: github.com/richardstockey/PaleoClimR) </w:t>
             </w:r>
           </w:p>
         </w:tc>
@@ -6845,7 +6306,6 @@
               </w:rPr>
               <w:t>B</w:t>
             </w:r>
-            <w:proofErr w:type="spellStart"/>
             <w:r>
               <w:rPr>
                 <w:rFonts w:ascii="Source Serif Pro Light" w:hAnsi="Source Serif Pro Light" w:cs="Times New Roman"/>
@@ -6854,18 +6314,7 @@
                 <w:sz w:val="20"/>
                 <w:szCs w:val="20"/>
               </w:rPr>
-              <w:t>iogeodynamics</w:t>
-            </w:r>
-            <w:proofErr w:type="spellEnd"/>
-            <w:r>
-              <w:rPr>
-                <w:rFonts w:ascii="Source Serif Pro Light" w:hAnsi="Source Serif Pro Light" w:cs="Times New Roman"/>
-                <w:i/>
-                <w:iCs/>
-                <w:sz w:val="20"/>
-                <w:szCs w:val="20"/>
-              </w:rPr>
-              <w:t xml:space="preserve"> and the Co-Evolution of Earth and Life</w:t>
+              <w:t>iogeodynamics and the Co-Evolution of Earth and Life</w:t>
             </w:r>
           </w:p>
           <w:p>
@@ -7976,27 +7425,7 @@
                 <w:szCs w:val="20"/>
                 <w:lang w:val="en-GB"/>
               </w:rPr>
-              <w:t xml:space="preserve">The European Institute for Marine Sciences (IUEM), </w:t>
-            </w:r>
-            <w:proofErr w:type="spellStart"/>
-            <w:r>
-              <w:rPr>
-                <w:rFonts w:ascii="Source Serif Pro Light" w:hAnsi="Source Serif Pro Light" w:cs="Times New Roman"/>
-                <w:sz w:val="20"/>
-                <w:szCs w:val="20"/>
-                <w:lang w:val="en-GB"/>
-              </w:rPr>
-              <w:t>Lagonna-Daoulas</w:t>
-            </w:r>
-            <w:proofErr w:type="spellEnd"/>
-            <w:r>
-              <w:rPr>
-                <w:rFonts w:ascii="Source Serif Pro Light" w:hAnsi="Source Serif Pro Light" w:cs="Times New Roman"/>
-                <w:sz w:val="20"/>
-                <w:szCs w:val="20"/>
-                <w:lang w:val="en-GB"/>
-              </w:rPr>
-              <w:t>, Brittany, France</w:t>
+              <w:t>The European Institute for Marine Sciences (IUEM), Lagonna-Daoulas, Brittany, France</w:t>
             </w:r>
           </w:p>
         </w:tc>
@@ -8564,25 +7993,14 @@
                 <w:lang w:val="en-GB"/>
               </w:rPr>
             </w:pPr>
-            <w:proofErr w:type="spellStart"/>
-            <w:r>
-              <w:rPr>
-                <w:rFonts w:ascii="Source Serif Pro Light" w:hAnsi="Source Serif Pro Light" w:cs="Times New Roman"/>
-                <w:sz w:val="23"/>
-                <w:szCs w:val="23"/>
-                <w:lang w:val="en-GB"/>
-              </w:rPr>
-              <w:t>MSci</w:t>
-            </w:r>
-            <w:proofErr w:type="spellEnd"/>
-            <w:r>
-              <w:rPr>
-                <w:rFonts w:ascii="Source Serif Pro Light" w:hAnsi="Source Serif Pro Light" w:cs="Times New Roman"/>
-                <w:sz w:val="23"/>
-                <w:szCs w:val="23"/>
-                <w:lang w:val="en-GB"/>
-              </w:rPr>
-              <w:t xml:space="preserve"> Marine Biology with Oceanography, University of Southampton</w:t>
+            <w:r>
+              <w:rPr>
+                <w:rFonts w:ascii="Source Serif Pro Light" w:hAnsi="Source Serif Pro Light" w:cs="Times New Roman"/>
+                <w:sz w:val="23"/>
+                <w:szCs w:val="23"/>
+                <w:lang w:val="en-GB"/>
+              </w:rPr>
+              <w:t>MSci Marine Biology with Oceanography, University of Southampton</w:t>
             </w:r>
           </w:p>
         </w:tc>
@@ -8701,7 +8119,6 @@
                 <w:lang w:val="en-GB"/>
               </w:rPr>
             </w:pPr>
-            <w:proofErr w:type="spellStart"/>
             <w:r>
               <w:rPr>
                 <w:rFonts w:ascii="Source Serif Pro Light" w:hAnsi="Source Serif Pro Light" w:cs="Times New Roman"/>
@@ -8711,7 +8128,6 @@
               </w:rPr>
               <w:t>BSci</w:t>
             </w:r>
-            <w:proofErr w:type="spellEnd"/>
             <w:r>
               <w:rPr>
                 <w:rFonts w:ascii="Source Serif Pro Light" w:hAnsi="Source Serif Pro Light" w:cs="Times New Roman"/>
@@ -8860,25 +8276,14 @@
                 <w:lang w:val="en-GB"/>
               </w:rPr>
             </w:pPr>
-            <w:proofErr w:type="spellStart"/>
-            <w:r>
-              <w:rPr>
-                <w:rFonts w:ascii="Source Serif Pro Light" w:hAnsi="Source Serif Pro Light" w:cs="Times New Roman"/>
-                <w:sz w:val="23"/>
-                <w:szCs w:val="23"/>
-                <w:lang w:val="en-GB"/>
-              </w:rPr>
-              <w:t>MSci</w:t>
-            </w:r>
-            <w:proofErr w:type="spellEnd"/>
-            <w:r>
-              <w:rPr>
-                <w:rFonts w:ascii="Source Serif Pro Light" w:hAnsi="Source Serif Pro Light" w:cs="Times New Roman"/>
-                <w:sz w:val="23"/>
-                <w:szCs w:val="23"/>
-                <w:lang w:val="en-GB"/>
-              </w:rPr>
-              <w:t xml:space="preserve"> </w:t>
+            <w:r>
+              <w:rPr>
+                <w:rFonts w:ascii="Source Serif Pro Light" w:hAnsi="Source Serif Pro Light" w:cs="Times New Roman"/>
+                <w:sz w:val="23"/>
+                <w:szCs w:val="23"/>
+                <w:lang w:val="en-GB"/>
+              </w:rPr>
+              <w:t xml:space="preserve">MSci </w:t>
             </w:r>
             <w:r>
               <w:rPr>
@@ -8896,27 +8301,7 @@
                 <w:szCs w:val="23"/>
                 <w:lang w:val="en-GB"/>
               </w:rPr>
-              <w:t xml:space="preserve"> (</w:t>
-            </w:r>
-            <w:proofErr w:type="gramStart"/>
-            <w:r>
-              <w:rPr>
-                <w:rFonts w:ascii="Source Serif Pro Light" w:hAnsi="Source Serif Pro Light" w:cs="Times New Roman"/>
-                <w:sz w:val="23"/>
-                <w:szCs w:val="23"/>
-                <w:lang w:val="en-GB"/>
-              </w:rPr>
-              <w:t>third-year</w:t>
-            </w:r>
-            <w:proofErr w:type="gramEnd"/>
-            <w:r>
-              <w:rPr>
-                <w:rFonts w:ascii="Source Serif Pro Light" w:hAnsi="Source Serif Pro Light" w:cs="Times New Roman"/>
-                <w:sz w:val="23"/>
-                <w:szCs w:val="23"/>
-                <w:lang w:val="en-GB"/>
-              </w:rPr>
-              <w:t>)</w:t>
+              <w:t xml:space="preserve"> (third-year)</w:t>
             </w:r>
             <w:r>
               <w:rPr>
@@ -13011,31 +12396,7 @@
                 <w:szCs w:val="20"/>
                 <w:lang w:val="en-GB"/>
               </w:rPr>
-              <w:t xml:space="preserve"> for </w:t>
-            </w:r>
-            <w:proofErr w:type="spellStart"/>
-            <w:r>
-              <w:rPr>
-                <w:rFonts w:ascii="Source Serif Pro Light" w:hAnsi="Source Serif Pro Light" w:cs="Times New Roman"/>
-                <w:i/>
-                <w:iCs/>
-                <w:sz w:val="20"/>
-                <w:szCs w:val="20"/>
-                <w:lang w:val="en-GB"/>
-              </w:rPr>
-              <w:t>PalAss</w:t>
-            </w:r>
-            <w:proofErr w:type="spellEnd"/>
-            <w:r>
-              <w:rPr>
-                <w:rFonts w:ascii="Source Serif Pro Light" w:hAnsi="Source Serif Pro Light" w:cs="Times New Roman"/>
-                <w:i/>
-                <w:iCs/>
-                <w:sz w:val="20"/>
-                <w:szCs w:val="20"/>
-                <w:lang w:val="en-GB"/>
-              </w:rPr>
-              <w:t xml:space="preserve"> President’s Prize </w:t>
+              <w:t xml:space="preserve"> for PalAss President’s Prize </w:t>
             </w:r>
             <w:r>
               <w:rPr>
@@ -13537,31 +12898,7 @@
           <w:szCs w:val="22"/>
           <w:lang w:val="en-GB"/>
         </w:rPr>
-        <w:t xml:space="preserve">Journal of </w:t>
-      </w:r>
-      <w:proofErr w:type="gramStart"/>
-      <w:r>
-        <w:rPr>
-          <w:rFonts w:ascii="Source Serif Pro Light" w:hAnsi="Source Serif Pro Light" w:cs="Times New Roman"/>
-          <w:i/>
-          <w:iCs/>
-          <w:sz w:val="22"/>
-          <w:szCs w:val="22"/>
-          <w:lang w:val="en-GB"/>
-        </w:rPr>
-        <w:t>Open Source</w:t>
-      </w:r>
-      <w:proofErr w:type="gramEnd"/>
-      <w:r>
-        <w:rPr>
-          <w:rFonts w:ascii="Source Serif Pro Light" w:hAnsi="Source Serif Pro Light" w:cs="Times New Roman"/>
-          <w:i/>
-          <w:iCs/>
-          <w:sz w:val="22"/>
-          <w:szCs w:val="22"/>
-          <w:lang w:val="en-GB"/>
-        </w:rPr>
-        <w:t xml:space="preserve"> Science</w:t>
+        <w:t>Journal of Open Source Science</w:t>
       </w:r>
       <w:r>
         <w:rPr>
@@ -14726,31 +14063,7 @@
                 <w:szCs w:val="23"/>
                 <w:lang w:val="en-GB"/>
               </w:rPr>
-              <w:t>Stem Bytes Seminar Speaker, Women in Science and Engineering (</w:t>
-            </w:r>
-            <w:proofErr w:type="spellStart"/>
-            <w:r>
-              <w:rPr>
-                <w:rFonts w:ascii="Source Serif Pro SemiBold" w:hAnsi="Source Serif Pro SemiBold" w:cs="Times New Roman"/>
-                <w:b/>
-                <w:bCs/>
-                <w:sz w:val="23"/>
-                <w:szCs w:val="23"/>
-                <w:lang w:val="en-GB"/>
-              </w:rPr>
-              <w:t>WiSE</w:t>
-            </w:r>
-            <w:proofErr w:type="spellEnd"/>
-            <w:r>
-              <w:rPr>
-                <w:rFonts w:ascii="Source Serif Pro SemiBold" w:hAnsi="Source Serif Pro SemiBold" w:cs="Times New Roman"/>
-                <w:b/>
-                <w:bCs/>
-                <w:sz w:val="23"/>
-                <w:szCs w:val="23"/>
-                <w:lang w:val="en-GB"/>
-              </w:rPr>
-              <w:t xml:space="preserve">) chapter of the University of Southern California </w:t>
+              <w:t xml:space="preserve">Stem Bytes Seminar Speaker, Women in Science and Engineering (WiSE) chapter of the University of Southern California </w:t>
             </w:r>
           </w:p>
           <w:p>
@@ -14947,31 +14260,7 @@
                 <w:szCs w:val="20"/>
                 <w:lang w:val="en-GB"/>
               </w:rPr>
-              <w:t xml:space="preserve">Invited to discuss undergraduate </w:t>
-            </w:r>
-            <w:proofErr w:type="spellStart"/>
-            <w:r>
-              <w:rPr>
-                <w:rFonts w:ascii="Source Serif Pro Light" w:hAnsi="Source Serif Pro Light" w:cs="Times New Roman"/>
-                <w:i/>
-                <w:iCs/>
-                <w:sz w:val="20"/>
-                <w:szCs w:val="20"/>
-                <w:lang w:val="en-GB"/>
-              </w:rPr>
-              <w:t>honors</w:t>
-            </w:r>
-            <w:proofErr w:type="spellEnd"/>
-            <w:r>
-              <w:rPr>
-                <w:rFonts w:ascii="Source Serif Pro Light" w:hAnsi="Source Serif Pro Light" w:cs="Times New Roman"/>
-                <w:i/>
-                <w:iCs/>
-                <w:sz w:val="20"/>
-                <w:szCs w:val="20"/>
-                <w:lang w:val="en-GB"/>
-              </w:rPr>
-              <w:t xml:space="preserve"> thesis to a national audience on live radio</w:t>
+              <w:t>Invited to discuss undergraduate honors thesis to a national audience on live radio</w:t>
             </w:r>
           </w:p>
         </w:tc>
@@ -16235,25 +15524,7 @@
                 <w:sz w:val="23"/>
                 <w:szCs w:val="23"/>
               </w:rPr>
-              <w:t xml:space="preserve">, </w:t>
-            </w:r>
-            <w:proofErr w:type="spellStart"/>
-            <w:r>
-              <w:rPr>
-                <w:rFonts w:ascii="Source Serif Pro Light" w:hAnsi="Source Serif Pro Light" w:cs="Times New Roman"/>
-                <w:sz w:val="23"/>
-                <w:szCs w:val="23"/>
-              </w:rPr>
-              <w:t>Lagonna-Daoulas</w:t>
-            </w:r>
-            <w:proofErr w:type="spellEnd"/>
-            <w:r>
-              <w:rPr>
-                <w:rFonts w:ascii="Source Serif Pro Light" w:hAnsi="Source Serif Pro Light" w:cs="Times New Roman"/>
-                <w:sz w:val="23"/>
-                <w:szCs w:val="23"/>
-              </w:rPr>
-              <w:t xml:space="preserve">, France. </w:t>
+              <w:t xml:space="preserve">, Lagonna-Daoulas, France. </w:t>
             </w:r>
             <w:r>
               <w:rPr>
@@ -17086,11 +16357,6 @@
         <w:docPartUnique/>
       </w:docPartObj>
     </w:sdtPr>
-    <w:sdtEndPr>
-      <w:rPr>
-        <w:rStyle w:val="PageNumber"/>
-      </w:rPr>
-    </w:sdtEndPr>
     <w:sdtContent>
       <w:p>
         <w:pPr>
@@ -17143,11 +16409,6 @@
         <w:docPartUnique/>
       </w:docPartObj>
     </w:sdtPr>
-    <w:sdtEndPr>
-      <w:rPr>
-        <w:rStyle w:val="PageNumber"/>
-      </w:rPr>
-    </w:sdtEndPr>
     <w:sdtContent>
       <w:p>
         <w:pPr>

</xml_diff>